<commit_message>
Update literature sources with authentic Czech CZ.NIC books: CyberCrime and CyberSecurity
</commit_message>
<xml_diff>
--- a/Zaverecna_prace_Skodlivy_software_Babak.docx
+++ b/Zaverecna_prace_Skodlivy_software_Babak.docx
@@ -1434,7 +1434,7 @@
           <w:color w:val="000000"/>
           <w:sz w:val="24"/>
         </w:rPr>
-        <w:t>[1] SOUČEK, Michal. Úvod do kybernetické bezpečnosti. Praha: Grada Publishing, 2021. 168 s. ISBN 978-80-271-2940-0. (Česká odborná kniha)</w:t>
+        <w:t>[1] KOLOUCH, Jan. CyberCrime. Praha: CZ.NIC, 2016. Edice CZ.NIC. 424 s. ISBN 978-80-88168-15-7. Dostupné také z: https://knihy.nic.cz (Česká odborná kniha o malware a phishingu)</w:t>
       </w:r>
     </w:p>
     <w:p>
@@ -1450,7 +1450,7 @@
           <w:color w:val="000000"/>
           <w:sz w:val="24"/>
         </w:rPr>
-        <w:t>[2] NÚKIB (Národní úřad pro kybernetickou a informační bezpečnost). Zpráva o stavu kybernetické bezpečnosti České republiky za rok 2024. Brno: NÚKIB, 2025. Dostupné online z: https://nukib.gov.cz (Oficiální český zdroj)</w:t>
+        <w:t>[2] KOLOUCH, Jan, Pavel BAŠTA a kol. CyberSecurity. Praha: CZ.NIC, 2019. Edice CZ.NIC. 612 s. ISBN 978-80-88168-31-7. Dostupné také z: https://knihy.nic.cz (Odborná publikace o kybernetické bezpečnosti)</w:t>
       </w:r>
     </w:p>
     <w:p>
@@ -1466,7 +1466,7 @@
           <w:color w:val="000000"/>
           <w:sz w:val="24"/>
         </w:rPr>
-        <w:t>[3] NÚKIB. Vzdělávací portál a metodika prevence sociálního inženýrství. Dostupné z: https://osveta.nukib.gov.cz</w:t>
+        <w:t>[3] NÚKIB (Národní úřad pro kybernetickou a informační bezpečnost). Zpráva o stavu kybernetické bezpečnosti České republiky za rok 2024. Brno: NÚKIB, 2025. Dostupné online z: https://nukib.gov.cz (Oficiální český vládní zdroj)</w:t>
       </w:r>
     </w:p>
     <w:p>
@@ -1482,7 +1482,7 @@
           <w:color w:val="000000"/>
           <w:sz w:val="24"/>
         </w:rPr>
-        <w:t>[4] ENISA (Agentura Evropské unie pro kybernetickou bezpečnost). ENISA Threat Landscape 2024/2025: Cyber Threat Analysis. Heraklion: ENISA, 2024. Dostupné z: https://www.enisa.europa.eu</w:t>
+        <w:t>[4] NÚKIB. Vzdělávací portál a metodika prevence sociálního inženýrství. Dostupné z: https://osveta.nukib.gov.cz</w:t>
       </w:r>
     </w:p>
     <w:p>
@@ -1498,7 +1498,7 @@
           <w:color w:val="000000"/>
           <w:sz w:val="24"/>
         </w:rPr>
-        <w:t>[5] VERIZON. 2024–2025 Data Breach Investigations Report (DBIR). Verizon Business, 2025. Dostupné z: https://www.verizon.com/business/resources/reports/dbir/</w:t>
+        <w:t>[5] ENISA (Agentura Evropské unie pro kybernetickou bezpečnost). ENISA Threat Landscape 2024/2025: Cyber Threat Analysis. Heraklion: ENISA, 2024. Dostupné z: https://www.enisa.europa.eu</w:t>
       </w:r>
     </w:p>
     <w:p>
@@ -1514,7 +1514,23 @@
           <w:color w:val="000000"/>
           <w:sz w:val="24"/>
         </w:rPr>
-        <w:t>[6] NIST (National Institute of Standards and Technology). Special Publication 800-83 Rev. 1: Guide to Malware Incident Prevention and Handling. Gaithersburg: NIST, 2020. Dostupné z: https://csrc.nist.gov</w:t>
+        <w:t>[6] VERIZON. 2024–2025 Data Breach Investigations Report (DBIR). Verizon Business, 2025. Dostupné z: https://www.verizon.com/business/resources/reports/dbir/</w:t>
+      </w:r>
+    </w:p>
+    <w:p>
+      <w:pPr>
+        <w:spacing w:after="160" w:line="276" w:lineRule="auto"/>
+        <w:jc w:val="left"/>
+      </w:pPr>
+      <w:r>
+        <w:rPr>
+          <w:rFonts w:ascii="Times New Roman" w:hAnsi="Times New Roman"/>
+          <w:b w:val="0"/>
+          <w:i w:val="0"/>
+          <w:color w:val="000000"/>
+          <w:sz w:val="24"/>
+        </w:rPr>
+        <w:t>[7] NIST (National Institute of Standards and Technology). Special Publication 800-83 Rev. 1: Guide to Malware Incident Prevention and Handling. Gaithersburg: NIST, 2020. Dostupné z: https://csrc.nist.gov</w:t>
       </w:r>
     </w:p>
     <w:sectPr>

</xml_diff>